<commit_message>
proposal v0.61: screen PDR tasks by diagnostic value
</commit_message>
<xml_diff>
--- a/deliverables/AskInfer-Bench_完整人话版.docx
+++ b/deliverables/AskInfer-Bench_完整人话版.docx
@@ -131,7 +131,7 @@
                 <w:color w:val="5B6B7A"/>
                 <w:sz w:val="21"/>
               </w:rPr>
-              <w:t>v0.60 · 完整人话版</w:t>
+              <w:t>v0.61 · 完整人话版</w:t>
             </w:r>
           </w:p>
         </w:tc>
@@ -189,7 +189,7 @@
                 <w:color w:val="5B6B7A"/>
                 <w:sz w:val="21"/>
               </w:rPr>
-              <w:t>2026 年 8 月 24 日</w:t>
+              <w:t>2026 年 9 月 3 日</w:t>
             </w:r>
           </w:p>
         </w:tc>
@@ -314,6 +314,22 @@
           <w:rFonts w:ascii="Calibri" w:hAnsi="Calibri" w:eastAsia="PingFang SC"/>
         </w:rPr>
         <w:t>为什么是 Ask / Infer</w:t>
+      </w:r>
+    </w:p>
+    <w:p>
+      <w:pPr>
+        <w:numPr>
+          <w:ilvl w:val="0"/>
+          <w:numId w:val="10"/>
+        </w:numPr>
+        <w:spacing w:after="100" w:line="290" w:lineRule="auto"/>
+        <w:ind w:left="540" w:hanging="279"/>
+      </w:pPr>
+      <w:r>
+        <w:rPr>
+          <w:rFonts w:ascii="Calibri" w:hAnsi="Calibri" w:eastAsia="PingFang SC"/>
+        </w:rPr>
+        <w:t>PDR 50→15 怎么筛</w:t>
       </w:r>
     </w:p>
     <w:p>
@@ -455,7 +471,7 @@
           <w:color w:val="5B6B7A"/>
           <w:sz w:val="21"/>
         </w:rPr>
-        <w:t>阅读方式：先看主图；前半解释 Ask / Infer 和 δ，后半解释 rubric、CFA、排名反转与停止门。</w:t>
+        <w:t>阅读方式：先看 PDR 50→15 的筛选边界，再看 Ask / Infer 和 δ，最后看 rubric、CFA、排名反转与停止门。</w:t>
       </w:r>
     </w:p>
     <w:p>
@@ -507,7 +523,7 @@
               <a:graphicData uri="http://schemas.openxmlformats.org/drawingml/2006/picture">
                 <pic:pic>
                   <pic:nvPicPr>
-                    <pic:cNvPr id="0" name="AskInfer-Bench_评测框架_v0.60.png"/>
+                    <pic:cNvPr id="0" name="AskInfer-Bench_评测框架_v0.61.png"/>
                     <pic:cNvPicPr/>
                   </pic:nvPicPr>
                   <pic:blipFill>
@@ -1567,7 +1583,7 @@
           <w:rFonts w:ascii="Calibri" w:hAnsi="Calibri" w:eastAsia="PingFang SC"/>
           <w:b/>
         </w:rPr>
-        <w:t>可以复用，但只能做 source shell 和 bridge，不能直接当新 gold。</w:t>
+        <w:t>可以复用，但不能随机抽 15 题，也不能直接当新 gold。</w:t>
       </w:r>
     </w:p>
     <w:p>
@@ -1575,7 +1591,144 @@
         <w:rPr>
           <w:rFonts w:ascii="Calibri" w:hAnsi="Calibri" w:eastAsia="PingFang SC"/>
         </w:rPr>
-        <w:t>可以复用 PDR 的 task 主题和 structured persona，在同一批 Deep Research agent 上跑 full-persona 对照。不能把完整 persona 塞进 Ask 主条件，因为答案已经泄漏。也不能把 PDR 的 simulated context 叫真实 history。每个 PDR-derived case 仍要重新确认 task-specific preference、</w:t>
+        <w:t>PDR 原论文已经保证任务本身具有 complexity、clarity 和 personalization alignment。</w:t>
+      </w:r>
+      <w:hyperlink r:id="rId16">
+        <w:r>
+          <w:rPr>
+            <w:rFonts w:ascii="Calibri" w:hAnsi="Calibri" w:eastAsia="PingFang SC"/>
+            <w:color w:val="2E74B5"/>
+            <w:u w:val="single"/>
+          </w:rPr>
+          <w:t>[1]</w:t>
+        </w:r>
+      </w:hyperlink>
+      <w:r>
+        <w:rPr>
+          <w:rFonts w:ascii="Calibri" w:hAnsi="Calibri" w:eastAsia="PingFang SC"/>
+        </w:rPr>
+        <w:t xml:space="preserve"> 但我们问的问题更窄：用户差异是否会改变研究决定，而不只是让报告变长、变浅或换一种语气。因此先把官方 50 题逐题标为：</w:t>
+      </w:r>
+    </w:p>
+    <w:p>
+      <w:pPr>
+        <w:pStyle w:val="ListBullet"/>
+      </w:pPr>
+      <w:r>
+        <w:rPr>
+          <w:rFonts w:ascii="Courier New" w:hAnsi="Courier New" w:eastAsia="PingFang SC"/>
+          <w:color w:val="6A3E00"/>
+          <w:sz w:val="20"/>
+        </w:rPr>
+        <w:t>0</w:t>
+      </w:r>
+      <w:r>
+        <w:rPr>
+          <w:rFonts w:ascii="Calibri" w:hAnsi="Calibri" w:eastAsia="PingFang SC"/>
+        </w:rPr>
+        <w:t>：不同用户不该改变实质答案；</w:t>
+      </w:r>
+    </w:p>
+    <w:p>
+      <w:pPr>
+        <w:pStyle w:val="ListBullet"/>
+      </w:pPr>
+      <w:r>
+        <w:rPr>
+          <w:rFonts w:ascii="Courier New" w:hAnsi="Courier New" w:eastAsia="PingFang SC"/>
+          <w:color w:val="6A3E00"/>
+          <w:sz w:val="20"/>
+        </w:rPr>
+        <w:t>1</w:t>
+      </w:r>
+      <w:r>
+        <w:rPr>
+          <w:rFonts w:ascii="Calibri" w:hAnsi="Calibri" w:eastAsia="PingFang SC"/>
+        </w:rPr>
+        <w:t>：主要改变重点、顺序或呈现；</w:t>
+      </w:r>
+    </w:p>
+    <w:p>
+      <w:pPr>
+        <w:pStyle w:val="ListBullet"/>
+      </w:pPr>
+      <w:r>
+        <w:rPr>
+          <w:rFonts w:ascii="Courier New" w:hAnsi="Courier New" w:eastAsia="PingFang SC"/>
+          <w:color w:val="6A3E00"/>
+          <w:sz w:val="20"/>
+        </w:rPr>
+        <w:t>2</w:t>
+      </w:r>
+      <w:r>
+        <w:rPr>
+          <w:rFonts w:ascii="Calibri" w:hAnsi="Calibri" w:eastAsia="PingFang SC"/>
+        </w:rPr>
+        <w:t>：改变搜索内容、候选集合、约束、阈值、方案或结论。</w:t>
+      </w:r>
+    </w:p>
+    <w:p>
+      <w:r>
+        <w:rPr>
+          <w:rFonts w:ascii="Courier New" w:hAnsi="Courier New" w:eastAsia="PingFang SC"/>
+          <w:color w:val="6A3E00"/>
+          <w:sz w:val="20"/>
+        </w:rPr>
+        <w:t>2</w:t>
+      </w:r>
+      <w:r>
+        <w:rPr>
+          <w:rFonts w:ascii="Calibri" w:hAnsi="Calibri" w:eastAsia="PingFang SC"/>
+        </w:rPr>
+        <w:t xml:space="preserve"> 只是入场券。还要检查 history 是否自然可能留下相关证据、能否写出 2–4 个可验证 preference dimensions、是否真需要搜索分析、是否主要靠性别年龄等人口信息、以及 task 与官方 profile 有没有矛盾。年龄、性别和职业标签本身不算“偏好”；儿童题必须有真实的行为或照护证据，金融、健康和房产题还要专家检查安全性与可行性。例如官方马拉松题说用户“完全没有跑步经验”，但部分配对 profile 已经有跑步或长距离运动经历；这种题表面上很个性化，却会把信息冲突混进 Ask/Infer 能力，所以没有进入首选 15 题。</w:t>
+      </w:r>
+    </w:p>
+    <w:p>
+      <w:r>
+        <w:rPr>
+          <w:rFonts w:ascii="Calibri" w:hAnsi="Calibri" w:eastAsia="PingFang SC"/>
+        </w:rPr>
+        <w:t>现在选出的官方 task ID 是：</w:t>
+      </w:r>
+    </w:p>
+    <w:p>
+      <w:r>
+        <w:rPr>
+          <w:rFonts w:ascii="Courier New" w:hAnsi="Courier New" w:eastAsia="PingFang SC"/>
+          <w:color w:val="6A3E00"/>
+          <w:sz w:val="20"/>
+        </w:rPr>
+        <w:t>1, 4, 5, 6, 9, 10, 11, 16, 21, 22, 30, 33, 35, 39, 49</w:t>
+      </w:r>
+      <w:r>
+        <w:rPr>
+          <w:rFonts w:ascii="Calibri" w:hAnsi="Calibri" w:eastAsia="PingFang SC"/>
+        </w:rPr>
+        <w:t>。</w:t>
+      </w:r>
+    </w:p>
+    <w:p>
+      <w:r>
+        <w:rPr>
+          <w:rFonts w:ascii="Calibri" w:hAnsi="Calibri" w:eastAsia="PingFang SC"/>
+        </w:rPr>
+        <w:t>它们分别覆盖 PhD/MBA/论文投稿、金融与 AI 产品职业转型、国际求职、健身、背包旅行、投资与退休、个人媒体、宠物用品、户外装备、养老房和亲子沟通。Education 3、Career 3、Health 1、Travel 1、Finance 2、Creative 1、Shopping 2、Real Estate 1、Parenting 1；这个不均匀分布是筛选结果，不是人为配额。</w:t>
+      </w:r>
+    </w:p>
+    <w:p>
+      <w:r>
+        <w:rPr>
+          <w:rFonts w:ascii="Calibri" w:hAnsi="Calibri" w:eastAsia="PingFang SC"/>
+        </w:rPr>
+        <w:t>这 15 题按官方公开映射共有 76 个 task–user bridge pair，不是 75，因为 task 10 在公开数据里配了 6 位用户。Ask/Infer 真正做 matched/swapped 时，不会默认五个人都能组成 gold；每题仍要由两名人类在看不到模型输出时复核，再另选 A/B 用户、冻结 2–4 个 task-specific nodes 和自然 history evidence。</w:t>
+      </w:r>
+    </w:p>
+    <w:p>
+      <w:r>
+        <w:rPr>
+          <w:rFonts w:ascii="Calibri" w:hAnsi="Calibri" w:eastAsia="PingFang SC"/>
+        </w:rPr>
+        <w:t xml:space="preserve">可以复用 PDR 的 task 原文和 structured persona，在同一批 Deep Research agent 上跑 full-persona 对照。不能把完整 persona 塞进 Ask 主条件，因为答案已经泄漏。也不能把 PDR 的 simulated context 叫真实 history。完整 50 题表、逐题理由和机器入口保存在 </w:t>
       </w:r>
       <w:r>
         <w:rPr>
@@ -1583,13 +1736,13 @@
           <w:color w:val="6A3E00"/>
           <w:sz w:val="20"/>
         </w:rPr>
-        <w:t>δ</w:t>
+        <w:t>data/pdr_diagnostic_slice_v0_61/</w:t>
       </w:r>
       <w:r>
         <w:rPr>
           <w:rFonts w:ascii="Calibri" w:hAnsi="Calibri" w:eastAsia="PingFang SC"/>
         </w:rPr>
-        <w:t>、history evidence、matched/swapped 和真人 rubric。</w:t>
+        <w:t>，以后即使换题也必须公开原因，不能看模型分数后挑“最好看”的题。</w:t>
       </w:r>
     </w:p>
     <w:p>
@@ -2020,7 +2173,7 @@
         <w:rPr>
           <w:rFonts w:ascii="Calibri" w:hAnsi="Calibri" w:eastAsia="PingFang SC"/>
         </w:rPr>
-        <w:t>通过后才考虑 24 个独立基础任务（每个 vertical 8 个）；Infer/PDR bridge 保留 8–12 个 DR。样本量由 pilot 的 family-level 方差和最小实际重要差异决定。多跑 seed 不能替代多做独立 task family。</w:t>
+        <w:t>通过后，共享 Deep Research overlap pool 使用通过双人 qualification 的 15 个 PDR tasks；Coding 与 Data 暂各按 8 个独立任务规划，所以上限是 31 个基础任务，不追求三域数量相等。最终规模仍由 pilot 的 family-level 方差、人工通过率、预算和最小实际重要差异决定。不能看 agent 输出删题，多跑 seed 也不能替代多做独立 task family。</w:t>
       </w:r>
     </w:p>
     <w:p>
@@ -2388,7 +2541,7 @@
         <w:rPr>
           <w:rFonts w:ascii="Calibri" w:hAnsi="Calibri" w:eastAsia="PingFang SC"/>
         </w:rPr>
-        <w:t>我们暂时不能说模型会理解用户、排名一定反转，或这个方向已经超过现有 benchmark。v0.60 的正确状态是：一个可证伪、可做 novelty-kill pilot 的主线。</w:t>
+        <w:t>我们暂时不能说模型会理解用户、排名一定反转，或这个方向已经超过现有 benchmark。v0.61 的正确状态是：一个完成 50→15 pre-output task screen、但仍等待双人 qualification 与 novelty-kill pilot 的可证伪主线。</w:t>
       </w:r>
     </w:p>
     <w:p>
@@ -2666,7 +2819,7 @@
         <w:color w:val="5B6B7A"/>
         <w:sz w:val="18"/>
       </w:rPr>
-      <w:t xml:space="preserve">2026-8-24   ·   </w:t>
+      <w:t xml:space="preserve">2026-9-3   ·   </w:t>
     </w:r>
     <w:r>
       <w:rPr>
@@ -2699,7 +2852,7 @@
         <w:color w:val="5B6B7A"/>
         <w:sz w:val="18"/>
       </w:rPr>
-      <w:t xml:space="preserve">2026-8-24   ·   </w:t>
+      <w:t xml:space="preserve">2026-9-3   ·   </w:t>
     </w:r>
     <w:r>
       <w:rPr>
@@ -2732,7 +2885,7 @@
         <w:color w:val="5B6B7A"/>
         <w:sz w:val="18"/>
       </w:rPr>
-      <w:t xml:space="preserve">2026-8-24   ·   </w:t>
+      <w:t xml:space="preserve">2026-9-3   ·   </w:t>
     </w:r>
     <w:r>
       <w:rPr>

</xml_diff>

<commit_message>
proposal v0.62: freeze two-week execution plan
</commit_message>
<xml_diff>
--- a/deliverables/AskInfer-Bench_完整人话版.docx
+++ b/deliverables/AskInfer-Bench_完整人话版.docx
@@ -131,7 +131,7 @@
                 <w:color w:val="5B6B7A"/>
                 <w:sz w:val="21"/>
               </w:rPr>
-              <w:t>v0.61 · 完整人话版</w:t>
+              <w:t>v0.62 · 完整人话版</w:t>
             </w:r>
           </w:p>
         </w:tc>
@@ -523,7 +523,7 @@
               <a:graphicData uri="http://schemas.openxmlformats.org/drawingml/2006/picture">
                 <pic:pic>
                   <pic:nvPicPr>
-                    <pic:cNvPr id="0" name="AskInfer-Bench_评测框架_v0.61.png"/>
+                    <pic:cNvPr id="0" name="AskInfer-Bench_评测框架_v0.62.png"/>
                     <pic:cNvPicPr/>
                   </pic:nvPicPr>
                   <pic:blipFill>
@@ -2085,7 +2085,7 @@
         <w:rPr>
           <w:rFonts w:ascii="Calibri" w:hAnsi="Calibri" w:eastAsia="PingFang SC"/>
         </w:rPr>
-        <w:t xml:space="preserve">每题 3 个 </w:t>
+        <w:t xml:space="preserve">每题一个 A/B 用户对，在偏好节点层同时放入 high、low、zero </w:t>
       </w:r>
       <w:r>
         <w:rPr>
@@ -2099,7 +2099,7 @@
         <w:rPr>
           <w:rFonts w:ascii="Calibri" w:hAnsi="Calibri" w:eastAsia="PingFang SC"/>
         </w:rPr>
-        <w:t xml:space="preserve"> strata；</w:t>
+        <w:t>，不把同一题复制成三种 task-level 版本；</w:t>
       </w:r>
     </w:p>
     <w:p>
@@ -2110,7 +2110,7 @@
         <w:rPr>
           <w:rFonts w:ascii="Calibri" w:hAnsi="Calibri" w:eastAsia="PingFang SC"/>
         </w:rPr>
-        <w:t>4 个 agent；</w:t>
+        <w:t>必跑 Codex CLI、Claude Code、Gemini CLI 三个 agent system；OpenHands 只在 9 月 5 日前通过全部 smoke 时加入；</w:t>
       </w:r>
     </w:p>
     <w:p>
@@ -2121,7 +2121,7 @@
         <w:rPr>
           <w:rFonts w:ascii="Calibri" w:hAnsi="Calibri" w:eastAsia="PingFang SC"/>
         </w:rPr>
-        <w:t>Ask 的 No-Ask / Ask-Enabled / Oracle 三条件；</w:t>
+        <w:t>Ask 跑 No-Ask / Ask-Enabled / Oracle；其中 2 个 Deep Research task 另跑 I1 history 和 I3 Full Persona，A0=I0、A2=I2 直接复用；</w:t>
       </w:r>
     </w:p>
     <w:p>
@@ -2132,7 +2132,7 @@
         <w:rPr>
           <w:rFonts w:ascii="Calibri" w:hAnsi="Calibri" w:eastAsia="PingFang SC"/>
         </w:rPr>
-        <w:t>约 216 个 episode；</w:t>
+        <w:t>三个必跑系统共 114 个唯一 episode；加第四系统为 152；</w:t>
       </w:r>
     </w:p>
     <w:p>
@@ -2143,7 +2143,7 @@
         <w:rPr>
           <w:rFonts w:ascii="Calibri" w:hAnsi="Calibri" w:eastAsia="PingFang SC"/>
         </w:rPr>
-        <w:t>其中 2 个 Deep Research 任务追加 Infer/PDR bridge。</w:t>
+        <w:t>同一 matched block 在 2–6 小时内随机顺序运行，整批目标 48–72 小时，并重跑 5%–10% anchors。</w:t>
       </w:r>
     </w:p>
     <w:p>
@@ -2173,7 +2173,7 @@
         <w:rPr>
           <w:rFonts w:ascii="Calibri" w:hAnsi="Calibri" w:eastAsia="PingFang SC"/>
         </w:rPr>
-        <w:t>通过后，共享 Deep Research overlap pool 使用通过双人 qualification 的 15 个 PDR tasks；Coding 与 Data 暂各按 8 个独立任务规划，所以上限是 31 个基础任务，不追求三域数量相等。最终规模仍由 pilot 的 family-level 方差、人工通过率、预算和最小实际重要差异决定。不能看 agent 输出删题，多跑 seed 也不能替代多做独立 task family。</w:t>
+        <w:t>9 月 14 日过门后，第一轮只扩到 12 个独立基础任务，也就是 Research、Coding、Data 各 4 个；这是截稿前真正要争取完成的 scoped agent-system leaderboard。通过双人 qualification 的 15 个 PDR tasks 加 Coding/Data 各 8 个，只是后续 31 题的规划上限，不是两周内必须跑完的承诺。最终规模仍由 pilot 的 family-level 方差、人工通过率、预算和最小实际重要差异决定。不能看 agent 输出删题，多跑 seed 也不能替代多做独立 task family。</w:t>
       </w:r>
     </w:p>
     <w:p>
@@ -2541,7 +2541,7 @@
         <w:rPr>
           <w:rFonts w:ascii="Calibri" w:hAnsi="Calibri" w:eastAsia="PingFang SC"/>
         </w:rPr>
-        <w:t>我们暂时不能说模型会理解用户、排名一定反转，或这个方向已经超过现有 benchmark。v0.61 的正确状态是：一个完成 50→15 pre-output task screen、但仍等待双人 qualification 与 novelty-kill pilot 的可证伪主线。</w:t>
+        <w:t>我们暂时不能说模型会理解用户、排名一定反转，或这个方向已经超过现有 benchmark。v0.62 的正确状态是：一个完成 50→15 pre-output task screen、冻结六题执行候选与运行预算、但仍等待双人 qualification 和 novelty-kill pilot 的可证伪主线。</w:t>
       </w:r>
     </w:p>
     <w:p>

</xml_diff>